<commit_message>
feat(pv-video): aligner les photos, la connexion et l'export de la fiche.
Co-authored-by: Cursor <cursoragent@cursor.com>
</commit_message>
<xml_diff>
--- a/public/templates/PV-Video-template.docx
+++ b/public/templates/PV-Video-template.docx
@@ -637,9 +637,51 @@
           </w:p>
         </w:tc>
       </w:tr>
+      <w:tr>
+        <w:trPr>
+          <w:trHeight w:val="806"/>
+          <w:jc w:val="center"/>
+        </w:trPr>
+        <w:tc>
+          <w:tcPr>
+            <w:tcW w:w="3020" w:type="dxa"/>
+            <w:vAlign w:val="center"/>
+          </w:tcPr>
+          <w:p>
+            <w:pPr>
+              <w:jc w:val="center"/>
+            </w:pPr>
+          </w:p>
+          <w:p>
+            <w:pPr>
+              <w:jc w:val="center"/>
+            </w:pPr>
+            <w:r>
+              <w:t>Nombre de caméras</w:t>
+            </w:r>
+          </w:p>
+          <w:p>
+            <w:pPr>
+              <w:jc w:val="center"/>
+            </w:pPr>
+          </w:p>
+        </w:tc>
+        <w:tc>
+          <w:tcPr>
+            <w:tcW w:w="6040" w:type="dxa"/>
+            <w:vAlign w:val="center"/>
+          </w:tcPr>
+          <w:p>
+            <w:pPr>
+              <w:jc w:val="center"/>
+            </w:pPr>
+            <w:r>
+              <w:t>{nombre_cameras}</w:t>
+            </w:r>
+          </w:p>
+        </w:tc>
+      </w:tr>
     </w:tbl>
-    <w:p/>
-    <w:p/>
     <w:p/>
     <w:p/>
     <w:p/>
@@ -808,12 +850,30 @@
         </w:tc>
       </w:tr>
     </w:tbl>
-    <w:p/>
+    <w:p>
+      <w:pPr>
+        <w:sectPr>
+          <w:headerReference w:type="default" r:id="rId7"/>
+          <w:footerReference w:type="default" r:id="rId8"/>
+          <w:pgSz w:w="11906" w:h="16838"/>
+          <w:pgMar w:top="1134" w:right="1418" w:bottom="1134" w:left="1418" w:header="709" w:footer="709" w:gutter="0"/>
+          <w:pgBorders w:offsetFrom="page">
+            <w:top w:val="double" w:sz="4" w:space="24" w:color="2F5496" w:themeColor="accent1" w:themeShade="BF"/>
+            <w:left w:val="double" w:sz="4" w:space="24" w:color="2F5496" w:themeColor="accent1" w:themeShade="BF"/>
+            <w:bottom w:val="double" w:sz="4" w:space="24" w:color="2F5496" w:themeColor="accent1" w:themeShade="BF"/>
+            <w:right w:val="double" w:sz="4" w:space="24" w:color="2F5496" w:themeColor="accent1" w:themeShade="BF"/>
+          </w:pgBorders>
+          <w:cols w:space="708"/>
+          <w:docGrid w:linePitch="360"/>
+        </w:sectPr>
+      </w:pPr>
+    </w:p>
     <w:p>
       <w:pPr>
         <w:jc w:val="center"/>
       </w:pPr>
       <w:r>
+        <w:lastRenderedPageBreak/>
         <w:t>{%</w:t>
       </w:r>
       <w:proofErr w:type="spellStart"/>
@@ -825,15 +885,9 @@
         <w:t>}</w:t>
       </w:r>
     </w:p>
-    <w:p/>
-    <w:p/>
-    <w:p/>
-    <w:p/>
-    <w:p/>
-    <w:p/>
     <w:sectPr>
-      <w:headerReference w:type="default" r:id="rId7"/>
-      <w:footerReference w:type="default" r:id="rId8"/>
+      <w:headerReference w:type="default" r:id="rId9"/>
+      <w:footerReference w:type="default" r:id="rId10"/>
       <w:pgSz w:w="11906" w:h="16838"/>
       <w:pgMar w:top="1134" w:right="1418" w:bottom="1134" w:left="1418" w:header="709" w:footer="709" w:gutter="0"/>
       <w:pgBorders w:offsetFrom="page">
@@ -843,6 +897,7 @@
         <w:right w:val="double" w:sz="4" w:space="24" w:color="2F5496" w:themeColor="accent1" w:themeShade="BF"/>
       </w:pgBorders>
       <w:cols w:space="708"/>
+      <w:vAlign w:val="center"/>
       <w:docGrid w:linePitch="360"/>
     </w:sectPr>
   </w:body>
@@ -879,6 +934,117 @@
   <w:sdt>
     <w:sdtPr>
       <w:id w:val="239448646"/>
+      <w:docPartObj>
+        <w:docPartGallery w:val="Page Numbers (Bottom of Page)"/>
+        <w:docPartUnique/>
+      </w:docPartObj>
+    </w:sdtPr>
+    <w:sdtContent>
+      <w:p>
+        <w:pPr>
+          <w:pStyle w:val="Pieddepage"/>
+          <w:jc w:val="center"/>
+          <w:rPr>
+            <w:rFonts w:ascii="Arial" w:eastAsia="Times New Roman" w:hAnsi="Arial" w:cs="Arial"/>
+            <w:sz w:val="12"/>
+            <w:szCs w:val="12"/>
+            <w:lang w:eastAsia="fr-FR"/>
+          </w:rPr>
+        </w:pPr>
+        <w:r>
+          <w:rPr>
+            <w:rFonts w:ascii="Arial" w:eastAsia="Times New Roman" w:hAnsi="Arial" w:cs="Arial"/>
+            <w:sz w:val="12"/>
+            <w:szCs w:val="12"/>
+            <w:lang w:eastAsia="fr-FR"/>
+          </w:rPr>
+          <w:t>Autorisation administrative préalable : AUT-093-2113-01-12-20140362117</w:t>
+        </w:r>
+      </w:p>
+      <w:p>
+        <w:pPr>
+          <w:tabs>
+            <w:tab w:val="center" w:pos="4536"/>
+            <w:tab w:val="right" w:pos="9072"/>
+          </w:tabs>
+          <w:spacing w:after="0" w:line="240" w:lineRule="auto"/>
+          <w:jc w:val="center"/>
+          <w:rPr>
+            <w:rFonts w:ascii="Arial" w:eastAsia="Times New Roman" w:hAnsi="Arial" w:cs="Arial"/>
+            <w:sz w:val="12"/>
+            <w:szCs w:val="12"/>
+            <w:lang w:eastAsia="fr-FR"/>
+          </w:rPr>
+        </w:pPr>
+        <w:r>
+          <w:rPr>
+            <w:rFonts w:ascii="Arial" w:eastAsia="Times New Roman" w:hAnsi="Arial" w:cs="Arial"/>
+            <w:sz w:val="12"/>
+            <w:szCs w:val="12"/>
+            <w:lang w:eastAsia="fr-FR"/>
+          </w:rPr>
+          <w:t>« L’autorisation d’exercice ne confère aucune prérogative de puissance publique à l’entreprise ou aux personnes qui en bénéficient »</w:t>
+        </w:r>
+      </w:p>
+      <w:p>
+        <w:pPr>
+          <w:tabs>
+            <w:tab w:val="center" w:pos="4536"/>
+            <w:tab w:val="right" w:pos="9072"/>
+          </w:tabs>
+          <w:spacing w:after="0" w:line="240" w:lineRule="auto"/>
+          <w:jc w:val="center"/>
+          <w:rPr>
+            <w:rFonts w:ascii="Arial" w:eastAsia="Times New Roman" w:hAnsi="Arial" w:cs="Arial"/>
+            <w:sz w:val="12"/>
+            <w:szCs w:val="12"/>
+            <w:lang w:eastAsia="fr-FR"/>
+          </w:rPr>
+        </w:pPr>
+        <w:r>
+          <w:rPr>
+            <w:rFonts w:ascii="Arial" w:eastAsia="Times New Roman" w:hAnsi="Arial" w:cs="Arial"/>
+            <w:sz w:val="12"/>
+            <w:szCs w:val="12"/>
+            <w:lang w:eastAsia="fr-FR"/>
+          </w:rPr>
+          <w:t>(Art L.614-14 du Code de sécurité intérieure)</w:t>
+        </w:r>
+      </w:p>
+      <w:p>
+        <w:pPr>
+          <w:pStyle w:val="Pieddepage"/>
+          <w:jc w:val="right"/>
+        </w:pPr>
+        <w:r>
+          <w:fldChar w:fldCharType="begin"/>
+        </w:r>
+        <w:r>
+          <w:instrText>PAGE   \* MERGEFORMAT</w:instrText>
+        </w:r>
+        <w:r>
+          <w:fldChar w:fldCharType="separate"/>
+        </w:r>
+        <w:r>
+          <w:t>2</w:t>
+        </w:r>
+        <w:r>
+          <w:fldChar w:fldCharType="end"/>
+        </w:r>
+        <w:r>
+          <w:t>/</w:t>
+        </w:r>
+      </w:p>
+    </w:sdtContent>
+  </w:sdt>
+</w:ftr>
+</file>
+
+<file path=word/footer2.xml><?xml version="1.0" encoding="utf-8"?>
+<w:ftr xmlns:wpc="http://schemas.microsoft.com/office/word/2010/wordprocessingCanvas" xmlns:cx="http://schemas.microsoft.com/office/drawing/2014/chartex" xmlns:cx1="http://schemas.microsoft.com/office/drawing/2015/9/8/chartex" xmlns:cx2="http://schemas.microsoft.com/office/drawing/2015/10/21/chartex" xmlns:cx3="http://schemas.microsoft.com/office/drawing/2016/5/9/chartex" xmlns:cx4="http://schemas.microsoft.com/office/drawing/2016/5/10/chartex" xmlns:cx5="http://schemas.microsoft.com/office/drawing/2016/5/11/chartex" xmlns:cx6="http://schemas.microsoft.com/office/drawing/2016/5/12/chartex" xmlns:cx7="http://schemas.microsoft.com/office/drawing/2016/5/13/chartex" xmlns:cx8="http://schemas.microsoft.com/office/drawing/2016/5/14/chartex" xmlns:mc="http://schemas.openxmlformats.org/markup-compatibility/2006" xmlns:aink="http://schemas.microsoft.com/office/drawing/2016/ink" xmlns:am3d="http://schemas.microsoft.com/office/drawing/2017/model3d" xmlns:o="urn:schemas-microsoft-com:office:office" xmlns:oel="http://schemas.microsoft.com/office/2019/extlst" xmlns:r="http://schemas.openxmlformats.org/officeDocument/2006/relationships" xmlns:m="http://schemas.openxmlformats.org/officeDocument/2006/math" xmlns:v="urn:schemas-microsoft-com:vml" xmlns:wp14="http://schemas.microsoft.com/office/word/2010/wordprocessingDrawing" xmlns:wp="http://schemas.openxmlformats.org/drawingml/2006/wordprocessingDrawing" xmlns:w10="urn:schemas-microsoft-com:office:word" xmlns:w="http://schemas.openxmlformats.org/wordprocessingml/2006/main" xmlns:w14="http://schemas.microsoft.com/office/word/2010/wordml" xmlns:w15="http://schemas.microsoft.com/office/word/2012/wordml" xmlns:w16cex="http://schemas.microsoft.com/office/word/2018/wordml/cex" xmlns:w16cid="http://schemas.microsoft.com/office/word/2016/wordml/cid" xmlns:w16="http://schemas.microsoft.com/office/word/2018/wordml" xmlns:w16du="http://schemas.microsoft.com/office/word/2023/wordml/word16du" xmlns:w16sdtdh="http://schemas.microsoft.com/office/word/2020/wordml/sdtdatahash" xmlns:w16sdtfl="http://schemas.microsoft.com/office/word/2024/wordml/sdtformatlock" xmlns:w16se="http://schemas.microsoft.com/office/word/2015/wordml/symex" xmlns:wpg="http://schemas.microsoft.com/office/word/2010/wordprocessingGroup" xmlns:wpi="http://schemas.microsoft.com/office/word/2010/wordprocessingInk" xmlns:wne="http://schemas.microsoft.com/office/word/2006/wordml" xmlns:wps="http://schemas.microsoft.com/office/word/2010/wordprocessingShape" mc:Ignorable="w14 w15 w16se w16cid w16 w16cex w16sdtdh w16sdtfl w16du wp14">
+  <w:sdt>
+    <w:sdtPr>
+      <w:id w:val="-2015061197"/>
       <w:docPartObj>
         <w:docPartGallery w:val="Page Numbers (Bottom of Page)"/>
         <w:docPartUnique/>
@@ -1040,7 +1206,7 @@
         <w:u w:val="single"/>
       </w:rPr>
       <w:drawing>
-        <wp:anchor distT="0" distB="0" distL="114300" distR="114300" simplePos="0" relativeHeight="251659264" behindDoc="1" locked="0" layoutInCell="1" allowOverlap="1" wp14:anchorId="67CB55FB" wp14:editId="0988AE6B">
+        <wp:anchor distT="0" distB="0" distL="114300" distR="114300" simplePos="0" relativeHeight="251657216" behindDoc="1" locked="0" layoutInCell="1" allowOverlap="1" wp14:anchorId="67CB55FB" wp14:editId="0988AE6B">
           <wp:simplePos x="0" y="0"/>
           <wp:positionH relativeFrom="page">
             <wp:posOffset>350520</wp:posOffset>
@@ -1052,6 +1218,102 @@
           <wp:effectExtent l="0" t="0" r="0" b="0"/>
           <wp:wrapNone/>
           <wp:docPr id="12" name="Image 12" descr="En tête"/>
+          <wp:cNvGraphicFramePr>
+            <a:graphicFrameLocks xmlns:a="http://schemas.openxmlformats.org/drawingml/2006/main" noChangeAspect="1"/>
+          </wp:cNvGraphicFramePr>
+          <a:graphic xmlns:a="http://schemas.openxmlformats.org/drawingml/2006/main">
+            <a:graphicData uri="http://schemas.openxmlformats.org/drawingml/2006/picture">
+              <pic:pic xmlns:pic="http://schemas.openxmlformats.org/drawingml/2006/picture">
+                <pic:nvPicPr>
+                  <pic:cNvPr id="0" name="Picture 12" descr="En tête"/>
+                  <pic:cNvPicPr>
+                    <a:picLocks noChangeAspect="1" noChangeArrowheads="1"/>
+                  </pic:cNvPicPr>
+                </pic:nvPicPr>
+                <pic:blipFill>
+                  <a:blip r:embed="rId1" cstate="print">
+                    <a:extLst>
+                      <a:ext uri="{28A0092B-C50C-407E-A947-70E740481C1C}">
+                        <a14:useLocalDpi xmlns:a14="http://schemas.microsoft.com/office/drawing/2010/main" val="0"/>
+                      </a:ext>
+                    </a:extLst>
+                  </a:blip>
+                  <a:srcRect/>
+                  <a:stretch>
+                    <a:fillRect/>
+                  </a:stretch>
+                </pic:blipFill>
+                <pic:spPr bwMode="auto">
+                  <a:xfrm>
+                    <a:off x="0" y="0"/>
+                    <a:ext cx="2759383" cy="2280861"/>
+                  </a:xfrm>
+                  <a:prstGeom prst="rect">
+                    <a:avLst/>
+                  </a:prstGeom>
+                  <a:noFill/>
+                  <a:ln>
+                    <a:noFill/>
+                  </a:ln>
+                </pic:spPr>
+              </pic:pic>
+            </a:graphicData>
+          </a:graphic>
+          <wp14:sizeRelH relativeFrom="page">
+            <wp14:pctWidth>0</wp14:pctWidth>
+          </wp14:sizeRelH>
+          <wp14:sizeRelV relativeFrom="page">
+            <wp14:pctHeight>0</wp14:pctHeight>
+          </wp14:sizeRelV>
+        </wp:anchor>
+      </w:drawing>
+    </w:r>
+  </w:p>
+</w:hdr>
+</file>
+
+<file path=word/header2.xml><?xml version="1.0" encoding="utf-8"?>
+<w:hdr xmlns:wpc="http://schemas.microsoft.com/office/word/2010/wordprocessingCanvas" xmlns:cx="http://schemas.microsoft.com/office/drawing/2014/chartex" xmlns:cx1="http://schemas.microsoft.com/office/drawing/2015/9/8/chartex" xmlns:cx2="http://schemas.microsoft.com/office/drawing/2015/10/21/chartex" xmlns:cx3="http://schemas.microsoft.com/office/drawing/2016/5/9/chartex" xmlns:cx4="http://schemas.microsoft.com/office/drawing/2016/5/10/chartex" xmlns:cx5="http://schemas.microsoft.com/office/drawing/2016/5/11/chartex" xmlns:cx6="http://schemas.microsoft.com/office/drawing/2016/5/12/chartex" xmlns:cx7="http://schemas.microsoft.com/office/drawing/2016/5/13/chartex" xmlns:cx8="http://schemas.microsoft.com/office/drawing/2016/5/14/chartex" xmlns:mc="http://schemas.openxmlformats.org/markup-compatibility/2006" xmlns:aink="http://schemas.microsoft.com/office/drawing/2016/ink" xmlns:am3d="http://schemas.microsoft.com/office/drawing/2017/model3d" xmlns:o="urn:schemas-microsoft-com:office:office" xmlns:oel="http://schemas.microsoft.com/office/2019/extlst" xmlns:r="http://schemas.openxmlformats.org/officeDocument/2006/relationships" xmlns:m="http://schemas.openxmlformats.org/officeDocument/2006/math" xmlns:v="urn:schemas-microsoft-com:vml" xmlns:wp14="http://schemas.microsoft.com/office/word/2010/wordprocessingDrawing" xmlns:wp="http://schemas.openxmlformats.org/drawingml/2006/wordprocessingDrawing" xmlns:w10="urn:schemas-microsoft-com:office:word" xmlns:w="http://schemas.openxmlformats.org/wordprocessingml/2006/main" xmlns:w14="http://schemas.microsoft.com/office/word/2010/wordml" xmlns:w15="http://schemas.microsoft.com/office/word/2012/wordml" xmlns:w16cex="http://schemas.microsoft.com/office/word/2018/wordml/cex" xmlns:w16cid="http://schemas.microsoft.com/office/word/2016/wordml/cid" xmlns:w16="http://schemas.microsoft.com/office/word/2018/wordml" xmlns:w16du="http://schemas.microsoft.com/office/word/2023/wordml/word16du" xmlns:w16sdtdh="http://schemas.microsoft.com/office/word/2020/wordml/sdtdatahash" xmlns:w16sdtfl="http://schemas.microsoft.com/office/word/2024/wordml/sdtformatlock" xmlns:w16se="http://schemas.microsoft.com/office/word/2015/wordml/symex" xmlns:wpg="http://schemas.microsoft.com/office/word/2010/wordprocessingGroup" xmlns:wpi="http://schemas.microsoft.com/office/word/2010/wordprocessingInk" xmlns:wne="http://schemas.microsoft.com/office/word/2006/wordml" xmlns:wps="http://schemas.microsoft.com/office/word/2010/wordprocessingShape" mc:Ignorable="w14 w15 w16se w16cid w16 w16cex w16sdtdh w16sdtfl w16du wp14">
+  <w:p>
+    <w:pPr>
+      <w:jc w:val="center"/>
+      <w:rPr>
+        <w:b/>
+        <w:bCs/>
+        <w:sz w:val="32"/>
+        <w:szCs w:val="32"/>
+      </w:rPr>
+    </w:pPr>
+    <w:r>
+      <w:rPr>
+        <w:b/>
+        <w:bCs/>
+        <w:sz w:val="32"/>
+        <w:szCs w:val="32"/>
+      </w:rPr>
+      <w:t>Prise en compte Levée de doute Vidéo</w:t>
+    </w:r>
+    <w:r>
+      <w:rPr>
+        <w:rFonts w:ascii="Palatino Linotype" w:hAnsi="Palatino Linotype"/>
+        <w:noProof/>
+        <w:sz w:val="28"/>
+        <w:szCs w:val="28"/>
+        <w:u w:val="single"/>
+      </w:rPr>
+      <w:drawing>
+        <wp:anchor distT="0" distB="0" distL="114300" distR="114300" simplePos="0" relativeHeight="251658240" behindDoc="1" locked="0" layoutInCell="1" allowOverlap="1" wp14:anchorId="67CB55FB" wp14:editId="0988AE6B">
+          <wp:simplePos x="0" y="0"/>
+          <wp:positionH relativeFrom="page">
+            <wp:posOffset>350520</wp:posOffset>
+          </wp:positionH>
+          <wp:positionV relativeFrom="paragraph">
+            <wp:posOffset>-106679</wp:posOffset>
+          </wp:positionV>
+          <wp:extent cx="2747163" cy="2270760"/>
+          <wp:effectExtent l="0" t="0" r="0" b="0"/>
+          <wp:wrapNone/>
+          <wp:docPr id="1424674832" name="Image 1424674832" descr="En tête"/>
           <wp:cNvGraphicFramePr>
             <a:graphicFrameLocks xmlns:a="http://schemas.openxmlformats.org/drawingml/2006/main" noChangeAspect="1"/>
           </wp:cNvGraphicFramePr>

</xml_diff>